<commit_message>
Mise à jour du vision board v2.1
Correction de l'en tête
</commit_message>
<xml_diff>
--- a/docs/perturbations/j1/equipe-18-product-vision-board-v2.1.docx
+++ b/docs/perturbations/j1/equipe-18-product-vision-board-v2.1.docx
@@ -158,8 +158,8 @@
         <w:tblLook w:val="04A0" w:firstRow="1" w:lastRow="0" w:firstColumn="1" w:lastColumn="0" w:noHBand="0" w:noVBand="1"/>
       </w:tblPr>
       <w:tblGrid>
-        <w:gridCol w:w="2502"/>
-        <w:gridCol w:w="6354"/>
+        <w:gridCol w:w="2503"/>
+        <w:gridCol w:w="6353"/>
       </w:tblGrid>
       <w:tr>
         <w:trPr>
@@ -195,15 +195,7 @@
               <w:t>18</w:t>
             </w:r>
             <w:r>
-              <w:t xml:space="preserve"> (à </w:t>
-            </w:r>
-            <w:proofErr w:type="spellStart"/>
-            <w:r>
-              <w:t>personnaliser</w:t>
-            </w:r>
-            <w:proofErr w:type="spellEnd"/>
-            <w:r>
-              <w:t>)</w:t>
+              <w:t xml:space="preserve"> </w:t>
             </w:r>
           </w:p>
         </w:tc>
@@ -345,7 +337,43 @@
               <w:rPr>
                 <w:lang w:val="fr-FR"/>
               </w:rPr>
-              <w:t>v2.0 (post-perturbation J1 - intégration persona enseignante)</w:t>
+              <w:t>v2.</w:t>
+            </w:r>
+            <w:r>
+              <w:rPr>
+                <w:lang w:val="fr-FR"/>
+              </w:rPr>
+              <w:t>1</w:t>
+            </w:r>
+            <w:r>
+              <w:rPr>
+                <w:lang w:val="fr-FR"/>
+              </w:rPr>
+              <w:t xml:space="preserve"> (post-perturbation J1 </w:t>
+            </w:r>
+            <w:r>
+              <w:rPr>
+                <w:lang w:val="fr-FR"/>
+              </w:rPr>
+              <w:t>–</w:t>
+            </w:r>
+            <w:r>
+              <w:rPr>
+                <w:lang w:val="fr-FR"/>
+              </w:rPr>
+              <w:t xml:space="preserve"> </w:t>
+            </w:r>
+            <w:r>
+              <w:rPr>
+                <w:lang w:val="fr-FR"/>
+              </w:rPr>
+              <w:t xml:space="preserve">modification </w:t>
+            </w:r>
+            <w:r>
+              <w:rPr>
+                <w:lang w:val="fr-FR"/>
+              </w:rPr>
+              <w:t>persona enseignante)</w:t>
             </w:r>
           </w:p>
         </w:tc>
@@ -378,7 +406,16 @@
               <w:cnfStyle w:val="000000010000" w:firstRow="0" w:lastRow="0" w:firstColumn="0" w:lastColumn="0" w:oddVBand="0" w:evenVBand="0" w:oddHBand="0" w:evenHBand="1" w:firstRowFirstColumn="0" w:firstRowLastColumn="0" w:lastRowFirstColumn="0" w:lastRowLastColumn="0"/>
             </w:pPr>
             <w:r>
-              <w:t>29/06/2026 14h30</w:t>
+              <w:t>30</w:t>
+            </w:r>
+            <w:r>
+              <w:t>/06/2026 1</w:t>
+            </w:r>
+            <w:r>
+              <w:t>0</w:t>
+            </w:r>
+            <w:r>
+              <w:t>h30</w:t>
             </w:r>
           </w:p>
         </w:tc>
@@ -411,7 +448,7 @@
               <w:cnfStyle w:val="000000100000" w:firstRow="0" w:lastRow="0" w:firstColumn="0" w:lastColumn="0" w:oddVBand="0" w:evenVBand="0" w:oddHBand="1" w:evenHBand="0" w:firstRowFirstColumn="0" w:firstRowLastColumn="0" w:lastRowFirstColumn="0" w:lastRowLastColumn="0"/>
             </w:pPr>
             <w:r>
-              <w:t>En revue PO</w:t>
+              <w:t>Finish</w:t>
             </w:r>
           </w:p>
         </w:tc>
@@ -423,12 +460,6 @@
           <w:lang w:val="fr-FR"/>
         </w:rPr>
       </w:pPr>
-      <w:r>
-        <w:rPr>
-          <w:lang w:val="fr-FR"/>
-        </w:rPr>
-        <w:br w:type="page"/>
-      </w:r>
     </w:p>
     <w:p>
       <w:pPr>
@@ -443,8 +474,16 @@
           <w:sz w:val="36"/>
           <w:lang w:val="fr-FR"/>
         </w:rPr>
-        <w:lastRenderedPageBreak/>
-        <w:t>Table des matières</w:t>
+        <w:t>T</w:t>
+      </w:r>
+      <w:r>
+        <w:rPr>
+          <w:b/>
+          <w:color w:val="1E1B4B"/>
+          <w:sz w:val="36"/>
+          <w:lang w:val="fr-FR"/>
+        </w:rPr>
+        <w:t>able des matières</w:t>
       </w:r>
     </w:p>
     <w:sdt>
@@ -2979,21 +3018,7 @@
               <w:rPr>
                 <w:lang w:val="fr-FR"/>
               </w:rPr>
-              <w:t xml:space="preserve">Voir les scores d'une classe en quelques clics, identifier les décrocheurs, envoyer des conseils exploitables et conserver un </w:t>
-            </w:r>
-            <w:proofErr w:type="gramStart"/>
-            <w:r>
-              <w:rPr>
-                <w:lang w:val="fr-FR"/>
-              </w:rPr>
-              <w:t>contrôle</w:t>
-            </w:r>
-            <w:proofErr w:type="gramEnd"/>
-            <w:r>
-              <w:rPr>
-                <w:lang w:val="fr-FR"/>
-              </w:rPr>
-              <w:t xml:space="preserve"> pédagogique avant diffusion.</w:t>
+              <w:t>Voir les scores d'une classe en quelques clics, identifier les décrocheurs, envoyer des conseils exploitables et conserver un contrôle pédagogique avant diffusion.</w:t>
             </w:r>
           </w:p>
         </w:tc>
@@ -5416,21 +5441,7 @@
         <w:rPr>
           <w:b/>
         </w:rPr>
-        <w:t>• Cours Agile/Scrum (Mohamed EL AFRIT</w:t>
-      </w:r>
-      <w:proofErr w:type="gramStart"/>
-      <w:r>
-        <w:rPr>
-          <w:b/>
-        </w:rPr>
-        <w:t>) :</w:t>
-      </w:r>
-      <w:proofErr w:type="gramEnd"/>
-      <w:r>
-        <w:rPr>
-          <w:b/>
-        </w:rPr>
-        <w:t xml:space="preserve"> </w:t>
+        <w:t xml:space="preserve">• Cours Agile/Scrum (Mohamed EL AFRIT) : </w:t>
       </w:r>
       <w:r>
         <w:t>mohamedelafrit.com/teaching/Master_Classe_Agile/cours.html</w:t>
@@ -5587,21 +5598,7 @@
         <w:rPr>
           <w:b/>
         </w:rPr>
-        <w:t xml:space="preserve">, concurrent Khan </w:t>
-      </w:r>
-      <w:proofErr w:type="gramStart"/>
-      <w:r>
-        <w:rPr>
-          <w:b/>
-        </w:rPr>
-        <w:t>Academy :</w:t>
-      </w:r>
-      <w:proofErr w:type="gramEnd"/>
-      <w:r>
-        <w:rPr>
-          <w:b/>
-        </w:rPr>
-        <w:t xml:space="preserve"> </w:t>
+        <w:t xml:space="preserve">, concurrent Khan Academy : </w:t>
       </w:r>
       <w:r>
         <w:t>https://www.khanmigo.ai/</w:t>

</xml_diff>